<commit_message>
Math T5: fix merge (pages d'entrée unités 2-6 préservées) — rebuild final
Co-authored-by: arena-agent <297053741+arena-agent@users.noreply.github.com>
</commit_message>
<xml_diff>
--- a/manuel-math-t5/work_merge/u3.docx
+++ b/manuel-math-t5/work_merge/u3.docx
@@ -2,6 +2,147 @@
 <file path=word/document.xml><?xml version="1.0" encoding="utf-8"?>
 <w:document xmlns:wpc="http://schemas.microsoft.com/office/word/2010/wordprocessingCanvas" xmlns:mc="http://schemas.openxmlformats.org/markup-compatibility/2006" xmlns:o="urn:schemas-microsoft-com:office:office" xmlns:r="http://schemas.openxmlformats.org/officeDocument/2006/relationships" xmlns:m="http://schemas.openxmlformats.org/officeDocument/2006/math" xmlns:v="urn:schemas-microsoft-com:vml" xmlns:wp14="http://schemas.microsoft.com/office/word/2010/wordprocessingDrawing" xmlns:wp="http://schemas.openxmlformats.org/drawingml/2006/wordprocessingDrawing" xmlns:w10="urn:schemas-microsoft-com:office:word" xmlns:w="http://schemas.openxmlformats.org/wordprocessingml/2006/main" xmlns:w14="http://schemas.microsoft.com/office/word/2010/wordml" xmlns:w15="http://schemas.microsoft.com/office/word/2012/wordml" xmlns:wpg="http://schemas.microsoft.com/office/word/2010/wordprocessingGroup" xmlns:wpi="http://schemas.microsoft.com/office/word/2010/wordprocessingInk" xmlns:wne="http://schemas.microsoft.com/office/word/2006/wordml" xmlns:wps="http://schemas.microsoft.com/office/word/2010/wordprocessingShape" xmlns:cx="http://schemas.microsoft.com/office/drawing/2014/chartex" xmlns:cx1="http://schemas.microsoft.com/office/drawing/2015/9/8/chartex" xmlns:cx2="http://schemas.microsoft.com/office/drawing/2015/10/21/chartex" xmlns:cx3="http://schemas.microsoft.com/office/drawing/2016/5/9/chartex" xmlns:cx4="http://schemas.microsoft.com/office/drawing/2016/5/10/chartex" xmlns:cx5="http://schemas.microsoft.com/office/drawing/2016/5/11/chartex" xmlns:cx6="http://schemas.microsoft.com/office/drawing/2016/5/12/chartex" xmlns:cx7="http://schemas.microsoft.com/office/drawing/2016/5/13/chartex" xmlns:cx8="http://schemas.microsoft.com/office/drawing/2016/5/14/chartex" xmlns:aink="http://schemas.microsoft.com/office/drawing/2016/ink" xmlns:am3d="http://schemas.microsoft.com/office/drawing/2017/model3d" xmlns:w16cex="http://schemas.microsoft.com/office/word/2018/wordml/cex" xmlns:w16cid="http://schemas.microsoft.com/office/word/2016/wordml/cid" xmlns:w16="http://schemas.microsoft.com/office/word/2018/wordml" xmlns:w16sdtdh="http://schemas.microsoft.com/office/word/2020/wordml/sdtdatahash" xmlns:w16se="http://schemas.microsoft.com/office/word/2015/wordml/symex" mc:Ignorable="w14 w15 wp14">
   <w:body>
+    <w:p>
+      <w:pPr>
+        <w:spacing w:after="200" w:before="2200"/>
+        <w:jc w:val="center"/>
+      </w:pPr>
+      <w:r>
+        <w:rPr>
+          <w:rFonts w:ascii="Times New Roman" w:cs="Times New Roman" w:eastAsia="Times New Roman" w:hAnsi="Times New Roman"/>
+          <w:b/>
+          <w:bCs/>
+          <w:i w:val="false"/>
+          <w:iCs w:val="false"/>
+          <w:color w:val="1F4E79"/>
+          <w:sz w:val="76"/>
+          <w:szCs w:val="76"/>
+        </w:rPr>
+        <w:t xml:space="preserve">UNITÉ III</w:t>
+      </w:r>
+    </w:p>
+    <w:p>
+      <w:pPr>
+        <w:shd w:fill="EAF2F8" w:val="clear"/>
+        <w:spacing w:after="160"/>
+        <w:jc w:val="center"/>
+      </w:pPr>
+      <w:bookmarkStart w:name="u3" w:id="1"/>
+      <w:r>
+        <w:rPr>
+          <w:rFonts w:ascii="Times New Roman" w:cs="Times New Roman" w:eastAsia="Times New Roman" w:hAnsi="Times New Roman"/>
+          <w:b/>
+          <w:bCs/>
+          <w:i w:val="false"/>
+          <w:iCs w:val="false"/>
+          <w:color w:val="C00000"/>
+          <w:sz w:val="56"/>
+          <w:szCs w:val="56"/>
+        </w:rPr>
+        <w:t xml:space="preserve">ALGÈBRE</w:t>
+      </w:r>
+      <w:bookmarkEnd w:id="1"/>
+    </w:p>
+    <w:p>
+      <w:pPr>
+        <w:spacing w:after="400"/>
+        <w:jc w:val="center"/>
+      </w:pPr>
+      <w:r>
+        <w:rPr>
+          <w:rFonts w:ascii="Times New Roman" w:cs="Times New Roman" w:eastAsia="Times New Roman" w:hAnsi="Times New Roman"/>
+          <w:b w:val="false"/>
+          <w:bCs w:val="false"/>
+          <w:i/>
+          <w:iCs/>
+          <w:color w:val="2E7D32"/>
+          <w:sz w:val="24"/>
+          <w:szCs w:val="24"/>
+        </w:rPr>
+        <w:t xml:space="preserve">Sous-discipline du programme de Mathématiques T5</w:t>
+      </w:r>
+    </w:p>
+    <w:p>
+      <w:pPr>
+        <w:spacing w:after="120"/>
+        <w:jc w:val="center"/>
+      </w:pPr>
+      <w:r>
+        <w:rPr>
+          <w:rFonts w:ascii="Times New Roman" w:cs="Times New Roman" w:eastAsia="Times New Roman" w:hAnsi="Times New Roman"/>
+          <w:b/>
+          <w:bCs/>
+          <w:i w:val="false"/>
+          <w:iCs w:val="false"/>
+          <w:color w:val="C2185B"/>
+          <w:sz w:val="24"/>
+          <w:szCs w:val="24"/>
+        </w:rPr>
+        <w:t xml:space="preserve">Résultat d’apprentissage général</w:t>
+      </w:r>
+    </w:p>
+    <w:p>
+      <w:pPr>
+        <w:spacing w:after="300"/>
+        <w:jc w:val="center"/>
+      </w:pPr>
+      <w:r>
+        <w:rPr>
+          <w:rFonts w:ascii="Times New Roman" w:cs="Times New Roman" w:eastAsia="Times New Roman" w:hAnsi="Times New Roman"/>
+          <w:b w:val="false"/>
+          <w:bCs w:val="false"/>
+          <w:i w:val="false"/>
+          <w:iCs w:val="false"/>
+          <w:color w:val="000000"/>
+          <w:sz w:val="24"/>
+          <w:szCs w:val="24"/>
+        </w:rPr>
+        <w:t xml:space="preserve">comprendre des relations simples à partir de suites, de situations de proportionnalité et de situations d’égalité.</w:t>
+      </w:r>
+    </w:p>
+    <w:p>
+      <w:pPr>
+        <w:spacing w:after="120"/>
+        <w:jc w:val="center"/>
+      </w:pPr>
+      <w:r>
+        <w:rPr>
+          <w:rFonts w:ascii="Times New Roman" w:cs="Times New Roman" w:eastAsia="Times New Roman" w:hAnsi="Times New Roman"/>
+          <w:b/>
+          <w:bCs/>
+          <w:i w:val="false"/>
+          <w:iCs w:val="false"/>
+          <w:color w:val="C2185B"/>
+          <w:sz w:val="24"/>
+          <w:szCs w:val="24"/>
+        </w:rPr>
+        <w:t xml:space="preserve">Valeurs à véhiculer</w:t>
+      </w:r>
+    </w:p>
+    <w:p>
+      <w:pPr>
+        <w:spacing w:after="200"/>
+        <w:jc w:val="center"/>
+      </w:pPr>
+      <w:r>
+        <w:rPr>
+          <w:rFonts w:ascii="Times New Roman" w:cs="Times New Roman" w:eastAsia="Times New Roman" w:hAnsi="Times New Roman"/>
+          <w:b w:val="false"/>
+          <w:bCs w:val="false"/>
+          <w:i w:val="false"/>
+          <w:iCs w:val="false"/>
+          <w:color w:val="000000"/>
+          <w:sz w:val="24"/>
+          <w:szCs w:val="24"/>
+        </w:rPr>
+        <w:t xml:space="preserve">esprit de créativité et goût de l’effort.</w:t>
+      </w:r>
+    </w:p>
+    <w:p>
+      <w:r>
+        <w:br w:type="page"/>
+      </w:r>
+    </w:p>
     <w:p>
       <w:pPr>
         <w:spacing w:after="150" w:before="200"/>

</xml_diff>